<commit_message>
trim the hypotheses section and the SDG annex: keep the claim and what refutes it, move the operational criteria to the protocol, fix the H6 closing sentence, state the H2 result in the annex and regenerate the docx
</commit_message>
<xml_diff>
--- a/thesis/anexo-ods.docx
+++ b/thesis/anexo-ods.docx
@@ -2215,24 +2215,7 @@
           <w:szCs w:val="21"/>
           <w:lang w:val="es-ES"/>
         </w:rPr>
-        <w:t xml:space="preserve">La relación más directa es con el ODS 7, energía asequible y no contaminante, y a través de él con el ODS 13, acción por el clima. Un entrenamiento que no va a converger, o que va a hacerlo más despacio de lo que su presupuesto permite, consume la misma electricidad que uno bueno hasta que alguien lo detiene. Si una medida tomada en el primer 5 % del presupuesto anticipara ese desenlace, el resto de la energía podría ahorrarse, y la decisión de cortar dejaría de depender de la intuición de quien mira la curva. Esa es la promesa práctica del trabajo y también su límite, porque aquí solo se mide si la señal existe, y decidir a partir de ella queda para un estudio posterior. La relación con el objetivo se mantiene aunque la respuesta sea negativa. Calcular las métricas de gradiente cuesta cómputo, en esta matriz 24,1 de las 121,7 horas totales, y si ninguna de ellas supera a la información gratuita de la curva de </w:t>
-      </w:r>
-      <w:r>
-        <w:rPr>
-          <w:rFonts w:asciiTheme="minorHAnsi" w:hAnsiTheme="minorHAnsi" w:cstheme="minorHAnsi"/>
-          <w:i/>
-          <w:szCs w:val="21"/>
-          <w:lang w:val="es-ES"/>
-        </w:rPr>
-        <w:t xml:space="preserve">loss</w:t>
-      </w:r>
-      <w:r>
-        <w:rPr>
-          <w:rFonts w:asciiTheme="minorHAnsi" w:hAnsiTheme="minorHAnsi" w:cstheme="minorHAnsi"/>
-          <w:szCs w:val="21"/>
-          <w:lang w:val="es-ES"/>
-        </w:rPr>
-        <w:t xml:space="preserve">, el resultado dice a quien entrena que no gaste ese cómputo. Un resultado negativo bien medido evita un consumo tan real como el que evitaría un resultado positivo. El ODS 13 se queda en el nivel bajo porque el trabajo no mide emisiones ni energía, solo horas de una GPU, y cualquier conversión a kilovatios hora sería una estimación ajena a lo medido.</w:t>
+        <w:t xml:space="preserve">La relación más directa es con el ODS 7, energía asequible y no contaminante, y a través de él con el ODS 13, acción por el clima. Un entrenamiento que no va a converger, o que va a hacerlo más despacio de lo que su presupuesto permite, consume la misma electricidad que uno bueno hasta que alguien lo detiene. Si una medida tomada en el primer 5 % del presupuesto anticipara ese desenlace, el resto de la energía podría ahorrarse, y la decisión de cortar dejaría de depender de la intuición de quien mira la curva. Esa es la promesa práctica del trabajo y también su límite, porque aquí solo se mide si la señal existe, y decidir a partir de ella queda para un estudio posterior. La relación con el objetivo se mantiene con una respuesta negativa, que es la que este trabajo obtuvo. Calcular las métricas de gradiente cuesta cómputo, en esta matriz 24,1 de las 121,7 horas totales. Ninguna de ellas superó a la información gratuita de la curva de validación en la primera ventana, así que el resultado dice a quien entrena que no gaste ese cómputo. Un resultado negativo bien medido evita un consumo tan real como el que evitaría un resultado positivo. El ODS 13 se queda en el nivel bajo porque el trabajo no mide emisiones ni energía, solo horas de una GPU, y cualquier conversión a kilovatios hora sería una estimación ajena a lo medido.</w:t>
       </w:r>
     </w:p>
     <w:p>
@@ -2251,24 +2234,7 @@
           <w:szCs w:val="21"/>
           <w:lang w:val="es-ES"/>
         </w:rPr>
-        <w:t xml:space="preserve">El ODS 12, producción y consumo responsables, recoge la manera en que se ha gastado el cómputo del propio estudio. La matriz se diseñó una sola vez, con el tamaño mínimo que la pregunta necesitaba, y se ejecutó en una única GPU a lo largo de 121,7 horas de reloj. Antes de lanzarla se hizo un </w:t>
-      </w:r>
-      <w:r>
-        <w:rPr>
-          <w:rFonts w:asciiTheme="minorHAnsi" w:hAnsiTheme="minorHAnsi" w:cstheme="minorHAnsi"/>
-          <w:i/>
-          <w:szCs w:val="21"/>
-          <w:lang w:val="es-ES"/>
-        </w:rPr>
-        <w:t xml:space="preserve">pilot</w:t>
-      </w:r>
-      <w:r>
-        <w:rPr>
-          <w:rFonts w:asciiTheme="minorHAnsi" w:hAnsiTheme="minorHAnsi" w:cstheme="minorHAnsi"/>
-          <w:szCs w:val="21"/>
-          <w:lang w:val="es-ES"/>
-        </w:rPr>
-        <w:t xml:space="preserve"> corto por celda para fijar el presupuesto de </w:t>
+        <w:t xml:space="preserve">El ODS 12, producción y consumo responsables, recoge la manera en que se ha gastado el cómputo del propio estudio. La matriz se diseñó una sola vez, con el tamaño mínimo que la pregunta necesitaba, y se ejecutó en una única GPU a lo largo de 121,7 horas de reloj. Antes de lanzarla se hizo un piloto de calibración por celda para fijar el presupuesto de </w:t>
       </w:r>
       <w:r>
         <w:rPr>
@@ -2285,7 +2251,7 @@
           <w:szCs w:val="21"/>
           <w:lang w:val="es-ES"/>
         </w:rPr>
-        <w:t xml:space="preserve"> y no dejar correr ningún entrenamiento más allá de lo que su curva de validación justificaba. El lanzador guarda cada entrenamiento terminado y reanuda solo lo pendiente, así que ninguno se repitió por accidente. Los resultados completos, con los dos relojes de cada entrenamiento, el de aprendizaje y el de medición, están versionados junto al código, y cualquier lector puede reanalizarlos sin volver a entrenar nada. Declarar el coste entero de la instrumentación junto a su posible beneficio es la parte del consumo responsable que un estudio como este puede cumplir por sí mismo.</w:t>
+        <w:t xml:space="preserve"> sobre curvas de entrenamiento reales. El lanzador guarda cada entrenamiento terminado y reanuda solo lo pendiente, así que ninguno se repitió por accidente. Los resultados completos, con los dos relojes de cada entrenamiento, el de aprendizaje y el de medición, están versionados junto al código, y cualquier lector puede reanalizarlos sin volver a entrenar nada. Declarar el coste entero de la instrumentación junto a su posible beneficio es la parte del consumo responsable que un estudio como este puede cumplir por sí mismo.</w:t>
       </w:r>
     </w:p>
     <w:p>
@@ -2359,7 +2325,7 @@
           <w:szCs w:val="21"/>
           <w:lang w:val="es-ES"/>
         </w:rPr>
-        <w:t xml:space="preserve">Los 12 objetivos restantes no proceden. El trabajo no recoge datos nuevos y trabaja con cuatro conjuntos de datos públicos de imágenes, de uso general en la investigación, y no toma ninguna decisión que afecte a personas, a la salud, a la alimentación, al agua, a las ciudades, a los ecosistemas o a las instituciones. Tampoco tiene una dimensión de género ni de reducción de desigualdades más allá de la que comparte cualquier trabajo que publica su código en abierto. Marcarlos como no procedentes es más honesto que forzar una relación que la memoria no puede sostener.</w:t>
+        <w:t xml:space="preserve">Los 12 objetivos restantes no proceden. El trabajo no recoge datos nuevos y trabaja con cuatro conjuntos de datos públicos de imágenes, de uso general en la investigación. No toma ninguna decisión que afecte a personas, a la salud, a la alimentación, al agua, a las ciudades, a los ecosistemas o a las instituciones. Tampoco tiene una dimensión de género ni de reducción de desigualdades más allá de la que comparte cualquier trabajo que publica su código en abierto. Marcarlos como no procedentes es más honesto que forzar una relación que la memoria no puede sostener.</w:t>
       </w:r>
     </w:p>
     <w:p>
@@ -2378,7 +2344,7 @@
           <w:szCs w:val="21"/>
           <w:lang w:val="es-ES"/>
         </w:rPr>
-        <w:t xml:space="preserve">La Agenda 2030 pide a la ingeniería que gaste menos para conseguir lo mismo. En el aprendizaje automático, el gasto que más crece es el del entrenamiento, y saber pronto qué entrenamientos no compensan es una de las pocas palancas que no exige cambiar el modelo ni los datos. Este trabajo mide esa palanca antes de que nadie la mueva, y esa medida es lo que permite moverla con conocimiento de causa.</w:t>
+        <w:t xml:space="preserve">La Agenda 2030 pide a la ingeniería que gaste menos para conseguir lo mismo. En el aprendizaje automático, el gasto que más crece es el del entrenamiento, y saber pronto qué entrenamientos no compensan es una de las pocas vías de ahorro que no exige cambiar el modelo ni los datos. Este trabajo mide si la señal para esa decisión existe antes de que nadie la use, y encuentra que ninguna métrica de gradiente mejora a la más barata de todas, la curva de validación.</w:t>
       </w:r>
     </w:p>
     <w:sectPr>

</xml_diff>